<commit_message>
3.A.16: lista común de supuestos con el orden del temario antiguo (agentes racionales, información, producto homogéneo, mercado atomizado, libre entrada)
Co-Authored-By: Claude Opus 5.5 <noreply@anthropic.com>
Claude-Session: https://claude.ai/code/session_01PWJgAjs4PN1Rvp3aLA4tqT
</commit_message>
<xml_diff>
--- a/oposicion/temario/tercer-ejercicio/3A16.docx
+++ b/oposicion/temario/tercer-ejercicio/3A16.docx
@@ -2575,7 +2575,7 @@
                 <w:b/>
                 <w:bCs/>
               </w:rPr>
-              <w:t xml:space="preserve">Muchos compradores y vendedores (precio-aceptantes)</w:t>
+              <w:t xml:space="preserve">Agentes racionales</w:t>
             </w:r>
           </w:p>
         </w:tc>
@@ -2589,20 +2589,7 @@
               <w:jc w:val="left"/>
             </w:pPr>
             <w:r>
-              <w:t xml:space="preserve">cada uno es pequeño respecto al mercado y sus decisiones individuales no mueven el precio: todos son</w:t>
-            </w:r>
-            <w:r>
-              <w:t xml:space="preserve"> </w:t>
-            </w:r>
-            <w:r>
-              <w:rPr>
-                <w:b/>
-                <w:bCs/>
-              </w:rPr>
-              <w:t xml:space="preserve">precio-aceptantes</w:t>
-            </w:r>
-            <w:r>
-              <w:t xml:space="preserve">, y el precio lo determinan las decisiones de todos juntos, no las de ninguno en particular</w:t>
+              <w:t xml:space="preserve">los consumidores maximizan su utilidad y las empresas, su beneficio</w:t>
             </w:r>
           </w:p>
         </w:tc>
@@ -2624,112 +2611,6 @@
                 <w:bCs/>
               </w:rPr>
               <w:t xml:space="preserve">2</w:t>
-            </w:r>
-          </w:p>
-        </w:tc>
-        <w:tc>
-          <w:tcPr>
-            <w:vAlign w:val="center"/>
-          </w:tcPr>
-          <w:p>
-            <w:pPr>
-              <w:pStyle w:val="Compact"/>
-              <w:jc w:val="left"/>
-            </w:pPr>
-            <w:r>
-              <w:rPr>
-                <w:b/>
-                <w:bCs/>
-              </w:rPr>
-              <w:t xml:space="preserve">Producto homogéneo</w:t>
-            </w:r>
-          </w:p>
-        </w:tc>
-        <w:tc>
-          <w:tcPr>
-            <w:vAlign w:val="center"/>
-          </w:tcPr>
-          <w:p>
-            <w:pPr>
-              <w:pStyle w:val="Compact"/>
-              <w:jc w:val="left"/>
-            </w:pPr>
-            <w:r>
-              <w:t xml:space="preserve">los consumidores ven como sustitutivos perfectos las unidades de todas las empresas, de modo que solo les importa el precio</w:t>
-            </w:r>
-          </w:p>
-        </w:tc>
-      </w:tr>
-      <w:tr>
-        <w:tc>
-          <w:tcPr>
-            <w:vAlign w:val="center"/>
-          </w:tcPr>
-          <w:p>
-            <w:pPr>
-              <w:pStyle w:val="Compact"/>
-              <w:jc w:val="center"/>
-            </w:pPr>
-            <w:r>
-              <w:rPr>
-                <w:rStyle w:val="Textomorado"/>
-                <w:b/>
-                <w:bCs/>
-              </w:rPr>
-              <w:t xml:space="preserve">3</w:t>
-            </w:r>
-          </w:p>
-        </w:tc>
-        <w:tc>
-          <w:tcPr>
-            <w:vAlign w:val="center"/>
-          </w:tcPr>
-          <w:p>
-            <w:pPr>
-              <w:pStyle w:val="Compact"/>
-              <w:jc w:val="left"/>
-            </w:pPr>
-            <w:r>
-              <w:rPr>
-                <w:b/>
-                <w:bCs/>
-              </w:rPr>
-              <w:t xml:space="preserve">Libre entrada y salida</w:t>
-            </w:r>
-          </w:p>
-        </w:tc>
-        <w:tc>
-          <w:tcPr>
-            <w:vAlign w:val="center"/>
-          </w:tcPr>
-          <w:p>
-            <w:pPr>
-              <w:pStyle w:val="Compact"/>
-              <w:jc w:val="left"/>
-            </w:pPr>
-            <w:r>
-              <w:t xml:space="preserve">a largo plazo, si hay beneficios extraordinarios, entran empresas hasta agotarlos, y si hay pérdidas, salen</w:t>
-            </w:r>
-          </w:p>
-        </w:tc>
-      </w:tr>
-      <w:tr>
-        <w:tc>
-          <w:tcPr>
-            <w:vAlign w:val="center"/>
-          </w:tcPr>
-          <w:p>
-            <w:pPr>
-              <w:pStyle w:val="Compact"/>
-              <w:jc w:val="center"/>
-            </w:pPr>
-            <w:r>
-              <w:rPr>
-                <w:rStyle w:val="Textomorado"/>
-                <w:b/>
-                <w:bCs/>
-              </w:rPr>
-              <w:t xml:space="preserve">4</w:t>
             </w:r>
           </w:p>
         </w:tc>
@@ -2782,6 +2663,125 @@
                 <w:b/>
                 <w:bCs/>
               </w:rPr>
+              <w:t xml:space="preserve">3</w:t>
+            </w:r>
+          </w:p>
+        </w:tc>
+        <w:tc>
+          <w:tcPr>
+            <w:vAlign w:val="center"/>
+          </w:tcPr>
+          <w:p>
+            <w:pPr>
+              <w:pStyle w:val="Compact"/>
+              <w:jc w:val="left"/>
+            </w:pPr>
+            <w:r>
+              <w:rPr>
+                <w:b/>
+                <w:bCs/>
+              </w:rPr>
+              <w:t xml:space="preserve">Producto homogéneo (sin sustitutivos cercanos)</w:t>
+            </w:r>
+          </w:p>
+        </w:tc>
+        <w:tc>
+          <w:tcPr>
+            <w:vAlign w:val="center"/>
+          </w:tcPr>
+          <w:p>
+            <w:pPr>
+              <w:pStyle w:val="Compact"/>
+              <w:jc w:val="left"/>
+            </w:pPr>
+            <w:r>
+              <w:t xml:space="preserve">los consumidores ven como sustitutivos perfectos las unidades de todas las empresas, de modo que solo les importa el precio</w:t>
+            </w:r>
+          </w:p>
+        </w:tc>
+      </w:tr>
+      <w:tr>
+        <w:tc>
+          <w:tcPr>
+            <w:vAlign w:val="center"/>
+          </w:tcPr>
+          <w:p>
+            <w:pPr>
+              <w:pStyle w:val="Compact"/>
+              <w:jc w:val="center"/>
+            </w:pPr>
+            <w:r>
+              <w:rPr>
+                <w:rStyle w:val="Textomorado"/>
+                <w:b/>
+                <w:bCs/>
+              </w:rPr>
+              <w:t xml:space="preserve">4</w:t>
+            </w:r>
+          </w:p>
+        </w:tc>
+        <w:tc>
+          <w:tcPr>
+            <w:vAlign w:val="center"/>
+          </w:tcPr>
+          <w:p>
+            <w:pPr>
+              <w:pStyle w:val="Compact"/>
+              <w:jc w:val="left"/>
+            </w:pPr>
+            <w:r>
+              <w:rPr>
+                <w:b/>
+                <w:bCs/>
+              </w:rPr>
+              <w:t xml:space="preserve">Mercado atomizado: muchos compradores y vendedores (precio-aceptantes)</w:t>
+            </w:r>
+          </w:p>
+        </w:tc>
+        <w:tc>
+          <w:tcPr>
+            <w:vAlign w:val="center"/>
+          </w:tcPr>
+          <w:p>
+            <w:pPr>
+              <w:pStyle w:val="Compact"/>
+              <w:jc w:val="left"/>
+            </w:pPr>
+            <w:r>
+              <w:t xml:space="preserve">cada uno es pequeño respecto al mercado y sus decisiones individuales no mueven el precio: todos son</w:t>
+            </w:r>
+            <w:r>
+              <w:t xml:space="preserve"> </w:t>
+            </w:r>
+            <w:r>
+              <w:rPr>
+                <w:b/>
+                <w:bCs/>
+              </w:rPr>
+              <w:t xml:space="preserve">precio-aceptantes</w:t>
+            </w:r>
+            <w:r>
+              <w:t xml:space="preserve">, y el precio lo determinan las decisiones de todos juntos, no las de ninguno en particular</w:t>
+            </w:r>
+          </w:p>
+        </w:tc>
+      </w:tr>
+      <w:tr>
+        <w:tc>
+          <w:tcPr>
+            <w:vAlign w:val="center"/>
+          </w:tcPr>
+          <w:p>
+            <w:pPr>
+              <w:pStyle w:val="Compact"/>
+              <w:jc w:val="center"/>
+            </w:pPr>
+            <w:r>
+              <w:rPr>
+                <w:rStyle w:val="Textomorado"/>
+                <w:b/>
+                <w:bCs/>
+              </w:rPr>
               <w:t xml:space="preserve">5</w:t>
             </w:r>
           </w:p>
@@ -2800,7 +2800,7 @@
                 <w:b/>
                 <w:bCs/>
               </w:rPr>
-              <w:t xml:space="preserve">Agentes racionales</w:t>
+              <w:t xml:space="preserve">Libre entrada y salida (a largo plazo)</w:t>
             </w:r>
           </w:p>
         </w:tc>
@@ -2814,7 +2814,7 @@
               <w:jc w:val="left"/>
             </w:pPr>
             <w:r>
-              <w:t xml:space="preserve">los consumidores maximizan su utilidad y las empresas, su beneficio</w:t>
+              <w:t xml:space="preserve">a largo plazo, si hay beneficios extraordinarios, entran empresas hasta agotarlos, y si hay pérdidas, salen</w:t>
             </w:r>
           </w:p>
         </w:tc>
@@ -2842,7 +2842,7 @@
         </w:numPr>
       </w:pPr>
       <w:r>
-        <w:t xml:space="preserve">Con producto homogéneo e información perfecta (supuestos 2 y 4) hay un solo precio: nadie pagaría más por un producto idéntico que se vende más barato.</w:t>
+        <w:t xml:space="preserve">Con información perfecta y producto homogéneo (supuestos 2 y 3) hay un solo precio: nadie pagaría más por un producto idéntico que se vende más barato.</w:t>
       </w:r>
       <w:r>
         <w:rPr>
@@ -2854,7 +2854,7 @@
         <w:t xml:space="preserve"> </w:t>
       </w:r>
       <w:r>
-        <w:t xml:space="preserve">La libre entrada (supuesto 3) solo actúa a largo plazo: hasta el bloque III el número de empresas está fijo.</w:t>
+        <w:t xml:space="preserve">La libre entrada (supuesto 5) solo actúa a largo plazo: hasta el bloque III el número de empresas está fijo.</w:t>
       </w:r>
     </w:p>
     <w:p>
@@ -3395,7 +3395,7 @@
         </m:r>
       </m:oMath>
       <w:r>
-        <w:t xml:space="preserve">, es la cantidad de numerario que se entrega a cambio de una unidad, y es el mismo para todos (producto homogéneo e información perfecta, supuestos 2 y 4).</w:t>
+        <w:t xml:space="preserve">, es la cantidad de numerario que se entrega a cambio de una unidad, y es el mismo para todos (información perfecta y producto homogéneo, supuestos 2 y 3).</w:t>
       </w:r>
     </w:p>
     <w:p>
@@ -3417,7 +3417,7 @@
         <w:t xml:space="preserve"> </w:t>
       </w:r>
       <w:r>
-        <w:t xml:space="preserve">(supuesto 1), que optimizan (supuesto 5):</w:t>
+        <w:t xml:space="preserve">(supuesto 4), que optimizan (supuesto 1):</w:t>
       </w:r>
     </w:p>
     <w:p>
@@ -3667,7 +3667,7 @@
         <w:t xml:space="preserve">Número de empresas fijo y todos los factores variables</w:t>
       </w:r>
       <w:r>
-        <w:t xml:space="preserve">: en los bloques I y II no hay entrada ni salida y no hay costes hundidos. Es el largo plazo sin libre entrada; el corto plazo y la libre entrada, el supuesto 3, se estudian en el bloque III. Por eso la oferta de mercado de I y II no es perfectamente elástica.</w:t>
+        <w:t xml:space="preserve">: en los bloques I y II no hay entrada ni salida y no hay costes hundidos. Es el largo plazo sin libre entrada; el corto plazo y la libre entrada, el supuesto 5, se estudian en el bloque III. Por eso la oferta de mercado de I y II no es perfectamente elástica.</w:t>
       </w:r>
     </w:p>
     <w:bookmarkEnd w:id="29"/>
@@ -26370,7 +26370,7 @@
         <w:t xml:space="preserve">libre entrada</w:t>
       </w:r>
       <w:r>
-        <w:t xml:space="preserve">, el supuesto 3 de la competencia perfecta (tabla 1) y una aproximación razonable cuando se piensa en plazos largos. El número de empresas activas pasa a ser endógeno. ¿Qué precio rige entonces, y cuántas empresas hay?</w:t>
+        <w:t xml:space="preserve">, el supuesto 5 de la competencia perfecta (tabla 1) y una aproximación razonable cuando se piensa en plazos largos. El número de empresas activas pasa a ser endógeno. ¿Qué precio rige entonces, y cuántas empresas hay?</w:t>
       </w:r>
     </w:p>
     <w:bookmarkEnd w:id="156"/>
@@ -31234,7 +31234,7 @@
         </w:numPr>
       </w:pPr>
       <w:r>
-        <w:t xml:space="preserve">Al levantar el supuesto de muchos vendedores precio-aceptantes (1) o el de producto homogéneo (2) se llega al monopolio, la competencia monopolística y el oligopolio</w:t>
+        <w:t xml:space="preserve">Al levantar el supuesto de muchos vendedores precio-aceptantes (4) o el de producto homogéneo (3) se llega al monopolio, la competencia monopolística y el oligopolio</w:t>
       </w:r>
       <w:r>
         <w:t xml:space="preserve"> </w:t>
@@ -44963,7 +44963,7 @@
         <w:t xml:space="preserve"> </w:t>
       </w:r>
       <w:r>
-        <w:t xml:space="preserve">Al relajar el supuesto 4 se llega a la economía de la información</w:t>
+        <w:t xml:space="preserve">Al relajar el supuesto 2 se llega a la economía de la información</w:t>
       </w:r>
       <w:r>
         <w:t xml:space="preserve"> </w:t>

</xml_diff>